<commit_message>
docs: sync English resume with latest Chinese version
</commit_message>
<xml_diff>
--- a/doc/Haoran_Feng_AIInfra_CUHK-Shenzhen_15024999885.docx
+++ b/doc/Haoran_Feng_AIInfra_CUHK-Shenzhen_15024999885.docx
@@ -694,6 +694,37 @@
               <w:spacing w:after="40" w:line="264" w:lineRule="auto"/>
               <w:ind w:left="351"/>
             </w:pPr>
+          </w:p>
+          <w:p>
+            <w:pPr>
+              <w:pStyle w:val="a"/>
+              <w:tabs>
+                <w:tab w:val="num" w:pos="360"/>
+              </w:tabs>
+              <w:spacing w:after="40" w:line="264" w:lineRule="auto"/>
+              <w:ind w:left="351" w:hanging="181"/>
+              <w:rPr>
+                <w:color w:val="auto"/>
+                <w:lang w:eastAsia="zh-CN"/>
+              </w:rPr>
+            </w:pPr>
+            <w:r>
+              <w:rPr>
+                <w:rFonts w:ascii="Times New Roman" w:hAnsi="Times New Roman" w:eastAsia="Times New Roman" w:cs="Times New Roman"/>
+                <w:bCs/>
+                <w:lang w:val="en-US" w:eastAsia="en-US"/>
+                <w:b/>
+              </w:rPr>
+              <w:t xml:space="preserve">Deterministic Router GEMM Optimization on H200: </w:t>
+            </w:r>
+            <w:r>
+              <w:rPr>
+                <w:rFonts w:ascii="Times New Roman" w:hAnsi="Times New Roman" w:eastAsia="Times New Roman" w:cs="Times New Roman"/>
+                <w:bCs/>
+                <w:lang w:val="en-US" w:eastAsia="en-US"/>
+              </w:rPr>
+              <w:t xml:space="preserve">Eliminated wasted work from vLLM Batch-Invariant mode’s fixed 128×128×64 persistent tile in small-M decode by designing and integrating deterministic Triton full-K and DeepGEMM SM90 BF16 paths, validated from kernel and CUDA Graph to full-model execution. For BF16 [M, 2048]×[2048, 128] with M=1/2/4/8/12, Triton full-K was 1.99–2.15× faster than the existing BI kernel, while DeepGEMM reduced Graph p50 from 13.79–14.94 μs to 4.74–4.86 μs (2.84–3.15×). Across 20 target-model scenarios, median 48-layer Router GEMM time fell from 789.23 to 210.01 μs/step (–73.39%) and median per-step GPU busy time by 6.16%, with bitwise agreement in 135/135 kernel and 20/20 full-model tests. Delivered a three-tier backend: DeepGEMM primary, Triton full-K low-dependency fallback, and persistent full-coverage fallback for M&gt;2048 or unsupported configurations.</w:t>
+            </w:r>
           </w:p>
           <w:p>
             <w:pPr>

</xml_diff>